<commit_message>
v2.1: Analytics is upload-first, three pillars (Classify, Analytics, Lineage)
Analytics page now defaults to Upload Data tab — upload JIRA data, AI verifies
every story against WAF, review side-by-side, save, then explore insights via
Summary, Sprint Trends, Monthly Rollups, and Timeline tabs.

Home page simplified to 3 cards. All docs and artifacts updated to reflect
the three-pillar structure.

Co-Authored-By: Claude Opus 4.6 <noreply@anthropic.com>
</commit_message>
<xml_diff>
--- a/docs/PRD_WAF_Classifier.docx
+++ b/docs/PRD_WAF_Classifier.docx
@@ -66,7 +66,7 @@
           <w:sz w:val="22"/>
           <w:szCs w:val="22"/>
         </w:rPr>
-        <w:t xml:space="preserve">Version 2.0  |  March 2026</w:t>
+        <w:t xml:space="preserve">Version 2.1  |  March 2026</w:t>
       </w:r>
     </w:p>
     <w:p>
@@ -169,7 +169,7 @@
           <w:sz w:val="22"/>
           <w:szCs w:val="22"/>
         </w:rPr>
-        <w:t xml:space="preserve">Version 2.0 expands the platform from a single-page classifier into a full-featured WAF management suite with five major capabilities: AI-powered classification, a real-time dashboard, historical analytics, bulk verification with import, and epic lineage tracking. All data persists in a local SQLite database.</w:t>
+        <w:t xml:space="preserve">Version 2.1 expands the platform from a single-page classifier into a full-featured WAF management suite with five major capabilities: AI-powered classification, a real-time dashboard, historical analytics, bulk verification with import, and epic lineage tracking. All data persists in a local SQLite database.</w:t>
       </w:r>
     </w:p>
     <w:p>
@@ -1436,7 +1436,7 @@
           <w:sz w:val="22"/>
           <w:szCs w:val="22"/>
         </w:rPr>
-        <w:t xml:space="preserve">Use the dashboard for real-time monitoring of classification activity. Use the historical view for sprint-over-sprint trends, monthly rollups, and period comparisons. Use bulk verify and import for quarterly alignment audits.</w:t>
+        <w:t xml:space="preserve">Use Analytics to upload JIRA exports for AI verification, then explore insights: mismatches, sprint trends, monthly rollups, and filtered timelines.</w:t>
       </w:r>
     </w:p>
     <w:p>
@@ -1460,7 +1460,7 @@
           <w:sz w:val="22"/>
           <w:szCs w:val="22"/>
         </w:rPr>
-        <w:t xml:space="preserve">Use the historical view for monthly and quarterly investment analysis. Use the epic lineage page to see how story-level WAF tags roll up through features to parent epics across the portfolio.</w:t>
+        <w:t xml:space="preserve">Use Analytics for monthly and quarterly investment analysis. Use Epic Lineage to see how story-level WAF tags roll up through features to parent epics across the portfolio.</w:t>
       </w:r>
     </w:p>
     <w:p>
@@ -1495,7 +1495,7 @@
           <w:sz w:val="22"/>
           <w:szCs w:val="22"/>
         </w:rPr>
-        <w:t xml:space="preserve">A central navigation hub with five menu cards linking to all major features. Includes a status bar showing API connectivity, WAF definitions loaded, ground truth count, and history database record count.</w:t>
+        <w:t xml:space="preserve">A central navigation hub with three menu cards (Classify, Analytics, Epic Lineage). Includes a status bar showing API connectivity, WAF definitions loaded, ground truth count, and history database record count.</w:t>
       </w:r>
     </w:p>
     <w:p>
@@ -1924,7 +1924,7 @@
         <w:rPr>
           <w:rFonts w:ascii="Arial" w:cs="Arial" w:eastAsia="Arial" w:hAnsi="Arial"/>
         </w:rPr>
-        <w:t xml:space="preserve">5.6 Real-Time Dashboard</w:t>
+        <w:t xml:space="preserve">5.6 Analytics Page</w:t>
       </w:r>
     </w:p>
     <w:p>
@@ -1937,7 +1937,7 @@
           <w:sz w:val="22"/>
           <w:szCs w:val="22"/>
         </w:rPr>
-        <w:t xml:space="preserve">A live dashboard for PMOs and leads showing classification activity at a glance:</w:t>
+        <w:t xml:space="preserve">An upload-first analytics page. Users upload JIRA exports, AI verifies every story against the WAF framework, and after saving, insights are available across five tabs: Upload Data (default), Summary, Sprint Trends, Monthly Rollups, and Timeline. The Summary tab includes:</w:t>
       </w:r>
     </w:p>
     <w:p>
@@ -2057,23 +2057,6 @@
           <w:szCs w:val="22"/>
         </w:rPr>
         <w:t xml:space="preserve">Recent Classifications table with time, story, category, color, confidence, status</w:t>
-      </w:r>
-    </w:p>
-    <w:p>
-      <w:pPr>
-        <w:pStyle w:val="ListParagraph"/>
-        <w:numPr>
-          <w:ilvl w:val="0"/>
-          <w:numId w:val="3"/>
-        </w:numPr>
-      </w:pPr>
-      <w:r>
-        <w:rPr>
-          <w:rFonts w:ascii="Arial" w:cs="Arial" w:eastAsia="Arial" w:hAnsi="Arial"/>
-          <w:sz w:val="22"/>
-          <w:szCs w:val="22"/>
-        </w:rPr>
-        <w:t xml:space="preserve">Auto-refreshes every 30 seconds</w:t>
       </w:r>
     </w:p>
     <w:p>
@@ -4772,7 +4755,7 @@
                 <w:sz w:val="20"/>
                 <w:szCs w:val="20"/>
               </w:rPr>
-              <w:t xml:space="preserve">Dashboard</w:t>
+              <w:t xml:space="preserve">(redirects)</w:t>
             </w:r>
           </w:p>
         </w:tc>
@@ -4799,7 +4782,7 @@
                 <w:sz w:val="20"/>
                 <w:szCs w:val="20"/>
               </w:rPr>
-              <w:t xml:space="preserve">Real-time KPIs and charts</w:t>
+              <w:t xml:space="preserve">Redirects to /history for backward compatibility</w:t>
             </w:r>
           </w:p>
         </w:tc>
@@ -4855,7 +4838,7 @@
                 <w:sz w:val="20"/>
                 <w:szCs w:val="20"/>
               </w:rPr>
-              <w:t xml:space="preserve">Historical View</w:t>
+              <w:t xml:space="preserve">Analytics</w:t>
             </w:r>
           </w:p>
         </w:tc>
@@ -4882,7 +4865,7 @@
                 <w:sz w:val="20"/>
                 <w:szCs w:val="20"/>
               </w:rPr>
-              <w:t xml:space="preserve">Sprint trends, monthly rollups, timeline, import</w:t>
+              <w:t xml:space="preserve">Upload data, AI verify, summary, sprint trends, monthly, timeline</w:t>
             </w:r>
           </w:p>
         </w:tc>
@@ -5086,7 +5069,7 @@
           <w:sz w:val="22"/>
           <w:szCs w:val="22"/>
         </w:rPr>
-        <w:t xml:space="preserve">Dashboard adoption: PMOs check dashboard at least weekly</w:t>
+        <w:t xml:space="preserve">Analytics adoption: PMOs upload and review data at least monthly</w:t>
       </w:r>
     </w:p>
     <w:p>
@@ -5265,7 +5248,7 @@
                 <w:sz w:val="20"/>
                 <w:szCs w:val="20"/>
               </w:rPr>
-              <w:t xml:space="preserve">Central navigation hub with 5 feature cards and system status bar</w:t>
+              <w:t xml:space="preserve">Central navigation hub with 3 feature cards and system status bar</w:t>
             </w:r>
           </w:p>
         </w:tc>
@@ -5294,7 +5277,7 @@
                 <w:sz w:val="20"/>
                 <w:szCs w:val="20"/>
               </w:rPr>
-              <w:t xml:space="preserve">Real-Time Dashboard</w:t>
+              <w:t xml:space="preserve">Upload-First Analytics</w:t>
             </w:r>
           </w:p>
         </w:tc>
@@ -5321,7 +5304,7 @@
                 <w:sz w:val="20"/>
                 <w:szCs w:val="20"/>
               </w:rPr>
-              <w:t xml:space="preserve">KPIs, category/confidence/color charts, daily trend, recent table</w:t>
+              <w:t xml:space="preserve">Upload JIRA data as entry point, AI verifies, then explore insights</w:t>
             </w:r>
           </w:p>
         </w:tc>
@@ -6570,7 +6553,7 @@
         <w:sz w:val="16"/>
         <w:szCs w:val="16"/>
       </w:rPr>
-      <w:t xml:space="preserve">WAF Classifier PRD v2.0</w:t>
+      <w:t xml:space="preserve">WAF Classifier PRD v2.1</w:t>
     </w:r>
   </w:p>
 </w:hdr>

</xml_diff>